<commit_message>
docs(mvp): sincronizar Plan .docx y corregir SP-1 a 5/5
Plan_MVP .docx regenerado desde el .md (DeepSeek como Coder). SP-1: C3
reevaluado a pass con matiz (solo el rojo #ef4444 es desvio real; el
resto rellena neutros no definidos) y C5 pass por el PO -> puerta 5/5.

Co-Authored-By: Claude Opus 4.8 <noreply@anthropic.com>
</commit_message>
<xml_diff>
--- a/openspec/mvp/Plan_MVP_Bearingworld_v1.0.docx
+++ b/openspec/mvp/Plan_MVP_Bearingworld_v1.0.docx
@@ -74,7 +74,213 @@
         <w:t xml:space="preserve"> </w:t>
       </w:r>
       <w:r>
-        <w:t xml:space="preserve">demo funcional para socio potencial + piloto real del arnés de implementación (LangGraph · Opus 4.8 / GLM-5.2)</w:t>
+        <w:t xml:space="preserve">demo funcional para socio potencial + piloto real del arnés de implementación (LangGraph · Opus 4.8 / DeepSeek-V4-Flash)</w:t>
+      </w:r>
+    </w:p>
+    <w:p>
+      <w:pPr>
+        <w:pStyle w:val="BlockText"/>
+      </w:pPr>
+      <w:r>
+        <w:rPr>
+          <w:b/>
+          <w:bCs/>
+        </w:rPr>
+        <w:t xml:space="preserve">Actualización · 5-ago-2026 (SP-1).</w:t>
+      </w:r>
+      <w:r>
+        <w:t xml:space="preserve"> </w:t>
+      </w:r>
+      <w:r>
+        <w:t xml:space="preserve">El nodo</w:t>
+      </w:r>
+      <w:r>
+        <w:t xml:space="preserve"> </w:t>
+      </w:r>
+      <w:r>
+        <w:rPr>
+          <w:b/>
+          <w:bCs/>
+        </w:rPr>
+        <w:t xml:space="preserve">Coder</w:t>
+      </w:r>
+      <w:r>
+        <w:t xml:space="preserve"> </w:t>
+      </w:r>
+      <w:r>
+        <w:t xml:space="preserve">del arnés es</w:t>
+      </w:r>
+      <w:r>
+        <w:t xml:space="preserve"> </w:t>
+      </w:r>
+      <w:r>
+        <w:rPr>
+          <w:b/>
+          <w:bCs/>
+        </w:rPr>
+        <w:t xml:space="preserve">DeepSeek-V4-Flash</w:t>
+      </w:r>
+      <w:r>
+        <w:t xml:space="preserve"> </w:t>
+      </w:r>
+      <w:r>
+        <w:t xml:space="preserve">(</w:t>
+      </w:r>
+      <w:r>
+        <w:rPr>
+          <w:rStyle w:val="VerbatimChar"/>
+        </w:rPr>
+        <w:t xml:space="preserve">deepseek-v4-flash</w:t>
+      </w:r>
+      <w:r>
+        <w:t xml:space="preserve">, DeepSeek oficial, vía</w:t>
+      </w:r>
+      <w:r>
+        <w:t xml:space="preserve"> </w:t>
+      </w:r>
+      <w:r>
+        <w:rPr>
+          <w:rStyle w:val="VerbatimChar"/>
+        </w:rPr>
+        <w:t xml:space="preserve">DEEPSEEK_API_KEY</w:t>
+      </w:r>
+      <w:r>
+        <w:t xml:space="preserve">), no GLM-5.2/DeepInfra como se</w:t>
+      </w:r>
+      <w:r>
+        <w:t xml:space="preserve"> </w:t>
+      </w:r>
+      <w:r>
+        <w:t xml:space="preserve">escribió el 4-ago. Cambio por coste (≈ $0.0036/pantalla en SP-1).</w:t>
+      </w:r>
+      <w:r>
+        <w:t xml:space="preserve"> </w:t>
+      </w:r>
+      <w:r>
+        <w:rPr>
+          <w:b/>
+          <w:bCs/>
+        </w:rPr>
+        <w:t xml:space="preserve">En todo el documento,</w:t>
+      </w:r>
+      <w:r>
+        <w:rPr>
+          <w:b/>
+          <w:bCs/>
+        </w:rPr>
+        <w:t xml:space="preserve"> </w:t>
+      </w:r>
+      <w:r>
+        <w:rPr>
+          <w:b/>
+          <w:bCs/>
+        </w:rPr>
+        <w:t xml:space="preserve">donde diga</w:t>
+      </w:r>
+      <w:r>
+        <w:rPr>
+          <w:b/>
+          <w:bCs/>
+        </w:rPr>
+        <w:t xml:space="preserve"> </w:t>
+      </w:r>
+      <w:r>
+        <w:rPr>
+          <w:b/>
+          <w:bCs/>
+        </w:rPr>
+        <w:t xml:space="preserve">“GLM-5.2”</w:t>
+      </w:r>
+      <w:r>
+        <w:rPr>
+          <w:b/>
+          <w:bCs/>
+        </w:rPr>
+        <w:t xml:space="preserve"> </w:t>
+      </w:r>
+      <w:r>
+        <w:rPr>
+          <w:b/>
+          <w:bCs/>
+        </w:rPr>
+        <w:t xml:space="preserve">/</w:t>
+      </w:r>
+      <w:r>
+        <w:rPr>
+          <w:b/>
+          <w:bCs/>
+        </w:rPr>
+        <w:t xml:space="preserve"> </w:t>
+      </w:r>
+      <w:r>
+        <w:rPr>
+          <w:b/>
+          <w:bCs/>
+        </w:rPr>
+        <w:t xml:space="preserve">“GLM”</w:t>
+      </w:r>
+      <w:r>
+        <w:rPr>
+          <w:b/>
+          <w:bCs/>
+        </w:rPr>
+        <w:t xml:space="preserve"> </w:t>
+      </w:r>
+      <w:r>
+        <w:rPr>
+          <w:b/>
+          <w:bCs/>
+        </w:rPr>
+        <w:t xml:space="preserve">/</w:t>
+      </w:r>
+      <w:r>
+        <w:rPr>
+          <w:b/>
+          <w:bCs/>
+        </w:rPr>
+        <w:t xml:space="preserve"> </w:t>
+      </w:r>
+      <w:r>
+        <w:rPr>
+          <w:b/>
+          <w:bCs/>
+        </w:rPr>
+        <w:t xml:space="preserve">“DeepInfra”</w:t>
+      </w:r>
+      <w:r>
+        <w:rPr>
+          <w:b/>
+          <w:bCs/>
+        </w:rPr>
+        <w:t xml:space="preserve"> </w:t>
+      </w:r>
+      <w:r>
+        <w:rPr>
+          <w:b/>
+          <w:bCs/>
+        </w:rPr>
+        <w:t xml:space="preserve">como Coder, léase DeepSeek-V4-Flash.</w:t>
+      </w:r>
+      <w:r>
+        <w:t xml:space="preserve"> </w:t>
+      </w:r>
+      <w:r>
+        <w:t xml:space="preserve">Ver</w:t>
+      </w:r>
+      <w:r>
+        <w:t xml:space="preserve"> </w:t>
+      </w:r>
+      <w:r>
+        <w:rPr>
+          <w:rStyle w:val="VerbatimChar"/>
+        </w:rPr>
+        <w:t xml:space="preserve">findings-register.md</w:t>
+      </w:r>
+      <w:r>
+        <w:t xml:space="preserve"> </w:t>
+      </w:r>
+      <w:r>
+        <w:t xml:space="preserve">F-001.</w:t>
       </w:r>
     </w:p>
     <w:p>
@@ -216,7 +422,17 @@
               <w:pStyle w:val="Compact"/>
             </w:pPr>
             <w:r>
-              <w:t xml:space="preserve">Cambia la paralelización de los sprints</w:t>
+              <w:rPr>
+                <w:b/>
+                <w:bCs/>
+              </w:rPr>
+              <w:t xml:space="preserve">CONFIRMADO</w:t>
+            </w:r>
+            <w:r>
+              <w:t xml:space="preserve"> </w:t>
+            </w:r>
+            <w:r>
+              <w:t xml:space="preserve">4/8/2026</w:t>
             </w:r>
           </w:p>
         </w:tc>
@@ -251,7 +467,17 @@
               <w:pStyle w:val="Compact"/>
             </w:pPr>
             <w:r>
-              <w:t xml:space="preserve">Es lo primero que se recorta si el D1 va mal</w:t>
+              <w:rPr>
+                <w:b/>
+                <w:bCs/>
+              </w:rPr>
+              <w:t xml:space="preserve">CONFIRMADO</w:t>
+            </w:r>
+            <w:r>
+              <w:t xml:space="preserve"> </w:t>
+            </w:r>
+            <w:r>
+              <w:t xml:space="preserve">4/8/2026</w:t>
             </w:r>
           </w:p>
         </w:tc>
@@ -385,13 +611,13 @@
       </w:r>
     </w:p>
     <w:bookmarkEnd w:id="9"/>
-    <w:bookmarkStart w:id="10" w:name="X98e6f4604ceb114d3c59c9358c08f633a2aacdb"/>
+    <w:bookmarkStart w:id="10" w:name="X05361d9f2c83928fcd32b2b9cf9b7dcfcb36fbf"/>
     <w:p>
       <w:pPr>
         <w:pStyle w:val="Heading2"/>
       </w:pPr>
       <w:r>
-        <w:t xml:space="preserve">1. Principio de reparto: qué hace GLM y qué no</w:t>
+        <w:t xml:space="preserve">1. Principio de reparto: qué hace el Coder (DeepSeek) y qué no</w:t>
       </w:r>
     </w:p>
     <w:p>
@@ -424,7 +650,7 @@
           <w:b/>
           <w:bCs/>
         </w:rPr>
-        <w:t xml:space="preserve">GLM-5.2 (nodo Coder del arnés) — trabajo de alto volumen, mecánico, con verdad de referencia visible:</w:t>
+        <w:t xml:space="preserve">DeepSeek-V4-Flash (nodo Coder del arnés) — trabajo de alto volumen, mecánico, con verdad de referencia visible:</w:t>
       </w:r>
     </w:p>
     <w:p>
@@ -1294,7 +1520,20 @@
               <w:pStyle w:val="Compact"/>
             </w:pPr>
             <w:r>
-              <w:t xml:space="preserve">Primera pantalla producida por el arnés: SRCH-02. Registro de métricas.</w:t>
+              <w:t xml:space="preserve">Primera pantalla producida por el arnés:</w:t>
+            </w:r>
+            <w:r>
+              <w:t xml:space="preserve"> </w:t>
+            </w:r>
+            <w:r>
+              <w:rPr>
+                <w:b/>
+                <w:bCs/>
+              </w:rPr>
+              <w:t xml:space="preserve">MSG-01</w:t>
+            </w:r>
+            <w:r>
+              <w:t xml:space="preserve">. Registro de métricas.</w:t>
             </w:r>
           </w:p>
         </w:tc>
@@ -1313,7 +1552,25 @@
     </w:tbl>
     <w:p>
       <w:pPr>
-        <w:pStyle w:val="BodyText"/>
+        <w:pStyle w:val="BlockText"/>
+      </w:pPr>
+      <w:r>
+        <w:rPr>
+          <w:b/>
+          <w:bCs/>
+        </w:rPr>
+        <w:t xml:space="preserve">Por qué MSG-01 es la primera del arnés y no SRCH-01.</w:t>
+      </w:r>
+      <w:r>
+        <w:t xml:space="preserve"> </w:t>
+      </w:r>
+      <w:r>
+        <w:t xml:space="preserve">La primera salida de GLM debe ser una pantalla representativa pero no crítica: MSG-01 es una lista, con estructura clara y fallo barato. SRCH-01 es la pantalla núcleo y la más delicada — entra en S2, con revisión a mano.</w:t>
+      </w:r>
+    </w:p>
+    <w:p>
+      <w:pPr>
+        <w:pStyle w:val="FirstParagraph"/>
       </w:pPr>
       <w:r>
         <w:rPr>
@@ -1475,17 +1732,17 @@
         <w:t xml:space="preserve">LangSmith</w:t>
       </w:r>
       <w:r>
-        <w:t xml:space="preserve">, GLM-5.2 vía</w:t>
-      </w:r>
-      <w:r>
-        <w:t xml:space="preserve"> </w:t>
-      </w:r>
-      <w:r>
-        <w:rPr>
-          <w:b/>
-          <w:bCs/>
-        </w:rPr>
-        <w:t xml:space="preserve">DeepInfra</w:t>
+        <w:t xml:space="preserve">, DeepSeek-V4-Flash vía</w:t>
+      </w:r>
+      <w:r>
+        <w:t xml:space="preserve"> </w:t>
+      </w:r>
+      <w:r>
+        <w:rPr>
+          <w:b/>
+          <w:bCs/>
+        </w:rPr>
+        <w:t xml:space="preserve">DeepSeek oficial</w:t>
       </w:r>
       <w:r>
         <w:t xml:space="preserve">, Opus/Sonnet vía</w:t>
@@ -1638,18 +1895,28 @@
               <w:pStyle w:val="Compact"/>
             </w:pPr>
             <w:r>
-              <w:t xml:space="preserve">SRCH-03, MSG-01</w:t>
-            </w:r>
-          </w:p>
-        </w:tc>
-        <w:tc>
-          <w:tcPr/>
-          <w:p>
-            <w:pPr>
-              <w:pStyle w:val="Compact"/>
-            </w:pPr>
-            <w:r>
-              <w:t xml:space="preserve">Arnés</w:t>
+              <w:rPr>
+                <w:b/>
+                <w:bCs/>
+              </w:rPr>
+              <w:t xml:space="preserve">SRCH-01</w:t>
+            </w:r>
+            <w:r>
+              <w:t xml:space="preserve"> </w:t>
+            </w:r>
+            <w:r>
+              <w:t xml:space="preserve">— capa presentacional: chips editables, tabla de resultados, selección de filas</w:t>
+            </w:r>
+          </w:p>
+        </w:tc>
+        <w:tc>
+          <w:tcPr/>
+          <w:p>
+            <w:pPr>
+              <w:pStyle w:val="Compact"/>
+            </w:pPr>
+            <w:r>
+              <w:t xml:space="preserve">Arnés + revisión a mano</w:t>
             </w:r>
           </w:p>
         </w:tc>
@@ -1883,18 +2150,28 @@
               <w:pStyle w:val="Compact"/>
             </w:pPr>
             <w:r>
-              <w:t xml:space="preserve">PANEL-01</w:t>
-            </w:r>
-          </w:p>
-        </w:tc>
-        <w:tc>
-          <w:tcPr/>
-          <w:p>
-            <w:pPr>
-              <w:pStyle w:val="Compact"/>
-            </w:pPr>
-            <w:r>
-              <w:t xml:space="preserve">Arnés</w:t>
+              <w:rPr>
+                <w:b/>
+                <w:bCs/>
+              </w:rPr>
+              <w:t xml:space="preserve">SRCH-01</w:t>
+            </w:r>
+            <w:r>
+              <w:t xml:space="preserve"> </w:t>
+            </w:r>
+            <w:r>
+              <w:t xml:space="preserve">— cableado VERA↔chips: consulta en lenguaje natural → filtros → tabla</w:t>
+            </w:r>
+          </w:p>
+        </w:tc>
+        <w:tc>
+          <w:tcPr/>
+          <w:p>
+            <w:pPr>
+              <w:pStyle w:val="Compact"/>
+            </w:pPr>
+            <w:r>
+              <w:t xml:space="preserve">Claude Code</w:t>
             </w:r>
           </w:p>
         </w:tc>
@@ -1907,6 +2184,41 @@
               <w:pStyle w:val="Compact"/>
             </w:pPr>
             <w:r>
+              <w:t xml:space="preserve">9</w:t>
+            </w:r>
+          </w:p>
+        </w:tc>
+        <w:tc>
+          <w:tcPr/>
+          <w:p>
+            <w:pPr>
+              <w:pStyle w:val="Compact"/>
+            </w:pPr>
+            <w:r>
+              <w:t xml:space="preserve">PANEL-01</w:t>
+            </w:r>
+          </w:p>
+        </w:tc>
+        <w:tc>
+          <w:tcPr/>
+          <w:p>
+            <w:pPr>
+              <w:pStyle w:val="Compact"/>
+            </w:pPr>
+            <w:r>
+              <w:t xml:space="preserve">Arnés</w:t>
+            </w:r>
+          </w:p>
+        </w:tc>
+      </w:tr>
+      <w:tr>
+        <w:tc>
+          <w:tcPr/>
+          <w:p>
+            <w:pPr>
+              <w:pStyle w:val="Compact"/>
+            </w:pPr>
+            <w:r>
               <w:t xml:space="preserve">10</w:t>
             </w:r>
           </w:p>
@@ -1919,6 +2231,44 @@
             </w:pPr>
             <w:r>
               <w:t xml:space="preserve">Contraoferta / modificación de oferta</w:t>
+            </w:r>
+          </w:p>
+        </w:tc>
+        <w:tc>
+          <w:tcPr/>
+          <w:p>
+            <w:pPr>
+              <w:pStyle w:val="Compact"/>
+            </w:pPr>
+            <w:r>
+              <w:t xml:space="preserve">Claude Code</w:t>
+            </w:r>
+          </w:p>
+        </w:tc>
+      </w:tr>
+      <w:tr>
+        <w:tc>
+          <w:tcPr/>
+          <w:p>
+            <w:pPr>
+              <w:pStyle w:val="Compact"/>
+            </w:pPr>
+            <w:r>
+              <w:t xml:space="preserve">10</w:t>
+            </w:r>
+          </w:p>
+        </w:tc>
+        <w:tc>
+          <w:tcPr/>
+          <w:p>
+            <w:pPr>
+              <w:pStyle w:val="Compact"/>
+            </w:pPr>
+            <w:r>
+              <w:t xml:space="preserve">“Consultar Seleccionados”</w:t>
+            </w:r>
+            <w:r>
+              <w:t xml:space="preserve">: SRCH-01 → creación de hilo (GAP-004)</w:t>
             </w:r>
           </w:p>
         </w:tc>
@@ -2826,13 +3176,29 @@
           <w:b/>
           <w:bCs/>
         </w:rPr>
-        <w:t xml:space="preserve">Dentro (9 pantallas):</w:t>
-      </w:r>
-      <w:r>
-        <w:t xml:space="preserve"> </w:t>
-      </w:r>
-      <w:r>
-        <w:t xml:space="preserve">app shell · PANEL-01 · INV-01 · SRCH-02 · SRCH-03 · MSG-01 · MSG-02 · VND-01 · panel vista-servidor</w:t>
+        <w:t xml:space="preserve">Dentro (8 pantallas):</w:t>
+      </w:r>
+      <w:r>
+        <w:t xml:space="preserve"> </w:t>
+      </w:r>
+      <w:r>
+        <w:t xml:space="preserve">app shell · PANEL-01 · INV-01 ·</w:t>
+      </w:r>
+      <w:r>
+        <w:t xml:space="preserve"> </w:t>
+      </w:r>
+      <w:r>
+        <w:rPr>
+          <w:b/>
+          <w:bCs/>
+        </w:rPr>
+        <w:t xml:space="preserve">SRCH-01</w:t>
+      </w:r>
+      <w:r>
+        <w:t xml:space="preserve"> </w:t>
+      </w:r>
+      <w:r>
+        <w:t xml:space="preserve">· MSG-01 · MSG-02 · VND-01 · panel vista-servidor</w:t>
       </w:r>
       <w:r>
         <w:t xml:space="preserve"> </w:t>
@@ -2847,7 +3213,49 @@
     </w:p>
     <w:p>
       <w:pPr>
-        <w:pStyle w:val="BodyText"/>
+        <w:pStyle w:val="BlockText"/>
+      </w:pPr>
+      <w:r>
+        <w:rPr>
+          <w:b/>
+          <w:bCs/>
+        </w:rPr>
+        <w:t xml:space="preserve">SRCH-01 es la pantalla núcleo de la demo.</w:t>
+      </w:r>
+      <w:r>
+        <w:t xml:space="preserve"> </w:t>
+      </w:r>
+      <w:r>
+        <w:t xml:space="preserve">Es donde VERA convierte la consulta en lenguaje natural en chips de filtro editables sobre la tabla de resultados, y donde la selección dispara</w:t>
+      </w:r>
+      <w:r>
+        <w:t xml:space="preserve"> </w:t>
+      </w:r>
+      <w:r>
+        <w:t xml:space="preserve">“Consultar Seleccionados”</w:t>
+      </w:r>
+      <w:r>
+        <w:t xml:space="preserve"> </w:t>
+      </w:r>
+      <w:r>
+        <w:t xml:space="preserve">que abre el hilo (resolución de GAP-004). Sin ella no hay búsqueda conversacional que enseñar. Su spec:</w:t>
+      </w:r>
+      <w:r>
+        <w:t xml:space="preserve"> </w:t>
+      </w:r>
+      <w:r>
+        <w:rPr>
+          <w:rStyle w:val="VerbatimChar"/>
+        </w:rPr>
+        <w:t xml:space="preserve">Rinworld_spec_SRCH-01.md</w:t>
+      </w:r>
+      <w:r>
+        <w:t xml:space="preserve">.</w:t>
+      </w:r>
+    </w:p>
+    <w:p>
+      <w:pPr>
+        <w:pStyle w:val="FirstParagraph"/>
       </w:pPr>
       <w:r>
         <w:rPr>
@@ -2860,12 +3268,62 @@
         <w:t xml:space="preserve"> </w:t>
       </w:r>
       <w:r>
-        <w:t xml:space="preserve">onboarding completo (REG-00…REG-09) · importación de inventario (INV-02/03/04) · INV-07 · foro · directorio · billing · admin · logística · recuperación de clave y passphrase · ADR-001 completo (backup, rotación, Argon2id) · roles y permisos · log de auditoría</w:t>
-      </w:r>
-    </w:p>
-    <w:p>
-      <w:pPr>
-        <w:pStyle w:val="BodyText"/>
+        <w:t xml:space="preserve">onboarding completo (REG-00…REG-09) · importación de inventario (INV-02/03/04) ·</w:t>
+      </w:r>
+      <w:r>
+        <w:t xml:space="preserve"> </w:t>
+      </w:r>
+      <w:r>
+        <w:rPr>
+          <w:b/>
+          <w:bCs/>
+        </w:rPr>
+        <w:t xml:space="preserve">SRCH-02</w:t>
+      </w:r>
+      <w:r>
+        <w:t xml:space="preserve"> </w:t>
+      </w:r>
+      <w:r>
+        <w:t xml:space="preserve">(búsqueda por lotes) ·</w:t>
+      </w:r>
+      <w:r>
+        <w:t xml:space="preserve"> </w:t>
+      </w:r>
+      <w:r>
+        <w:rPr>
+          <w:b/>
+          <w:bCs/>
+        </w:rPr>
+        <w:t xml:space="preserve">SRCH-03</w:t>
+      </w:r>
+      <w:r>
+        <w:t xml:space="preserve"> </w:t>
+      </w:r>
+      <w:r>
+        <w:t xml:space="preserve">(watchers) · INV-07 · foro · directorio · billing · admin · logística · recuperación de clave y passphrase · ADR-001 completo (backup, rotación, Argon2id) · roles y permisos · log de auditoría</w:t>
+      </w:r>
+    </w:p>
+    <w:p>
+      <w:pPr>
+        <w:pStyle w:val="BlockText"/>
+      </w:pPr>
+      <w:r>
+        <w:rPr>
+          <w:b/>
+          <w:bCs/>
+        </w:rPr>
+        <w:t xml:space="preserve">Por qué SRCH-02 y SRCH-03 quedan fuera.</w:t>
+      </w:r>
+      <w:r>
+        <w:t xml:space="preserve"> </w:t>
+      </w:r>
+      <w:r>
+        <w:t xml:space="preserve">SRCH-02 (pegar 50 referencias desde el ERP) es comercialmente atractivo para un distribuidor porque toca su dolor diario, pero no demuestra ninguno de los dos diferenciadores y no forma parte del flujo entre dos usuarios. SRCH-03 (watchers) es peor candidato aún para una demo en vivo: su valor solo se aprecia con el paso del tiempo, que es justo lo que no hay en una reunión.</w:t>
+      </w:r>
+    </w:p>
+    <w:p>
+      <w:pPr>
+        <w:pStyle w:val="FirstParagraph"/>
       </w:pPr>
       <w:r>
         <w:rPr>
@@ -2944,7 +3402,7 @@
         <w:t xml:space="preserve"> </w:t>
       </w:r>
       <w:r>
-        <w:t xml:space="preserve">el panel de vista-servidor y el Realtime. Son, respectivamente, el argumento y la prueba de que esto funciona.</w:t>
+        <w:t xml:space="preserve">SRCH-01, el panel de vista-servidor y el Realtime. Son, respectivamente, la demostración de VERA, el argumento del zero-knowledge y la prueba de que dos usuarios interactúan de verdad.</w:t>
       </w:r>
     </w:p>
     <w:p>
@@ -5266,7 +5724,7 @@
       <w:color w:themeColor="accent1" w:themeShade="BF" w:val="365F91"/>
     </w:rPr>
   </w:style>
-  <w:style w:type="paragraph" w:customStyle="1" w:styleId="SourceCode">
+  <w:style w:customStyle="1" w:styleId="SourceCode" w:type="paragraph">
     <w:name w:val="Source Code"/>
     <w:basedOn w:val="Normal"/>
     <w:link w:val="VerbatimChar"/>
@@ -5274,7 +5732,7 @@
       <w:wordWrap w:val="off"/>
     </w:pPr>
   </w:style>
-  <w:style w:type="character" w:customStyle="1" w:styleId="KeywordTok">
+  <w:style w:customStyle="1" w:styleId="KeywordTok" w:type="character">
     <w:name w:val="KeywordTok"/>
     <w:basedOn w:val="VerbatimChar"/>
     <w:rPr>
@@ -5282,77 +5740,77 @@
       <w:color w:val="007020"/>
     </w:rPr>
   </w:style>
-  <w:style w:type="character" w:customStyle="1" w:styleId="DataTypeTok">
+  <w:style w:customStyle="1" w:styleId="DataTypeTok" w:type="character">
     <w:name w:val="DataTypeTok"/>
     <w:basedOn w:val="VerbatimChar"/>
     <w:rPr>
       <w:color w:val="902000"/>
     </w:rPr>
   </w:style>
-  <w:style w:type="character" w:customStyle="1" w:styleId="DecValTok">
+  <w:style w:customStyle="1" w:styleId="DecValTok" w:type="character">
     <w:name w:val="DecValTok"/>
     <w:basedOn w:val="VerbatimChar"/>
     <w:rPr>
       <w:color w:val="40a070"/>
     </w:rPr>
   </w:style>
-  <w:style w:type="character" w:customStyle="1" w:styleId="BaseNTok">
+  <w:style w:customStyle="1" w:styleId="BaseNTok" w:type="character">
     <w:name w:val="BaseNTok"/>
     <w:basedOn w:val="VerbatimChar"/>
     <w:rPr>
       <w:color w:val="40a070"/>
     </w:rPr>
   </w:style>
-  <w:style w:type="character" w:customStyle="1" w:styleId="FloatTok">
+  <w:style w:customStyle="1" w:styleId="FloatTok" w:type="character">
     <w:name w:val="FloatTok"/>
     <w:basedOn w:val="VerbatimChar"/>
     <w:rPr>
       <w:color w:val="40a070"/>
     </w:rPr>
   </w:style>
-  <w:style w:type="character" w:customStyle="1" w:styleId="ConstantTok">
+  <w:style w:customStyle="1" w:styleId="ConstantTok" w:type="character">
     <w:name w:val="ConstantTok"/>
     <w:basedOn w:val="VerbatimChar"/>
     <w:rPr>
       <w:color w:val="880000"/>
     </w:rPr>
   </w:style>
-  <w:style w:type="character" w:customStyle="1" w:styleId="CharTok">
+  <w:style w:customStyle="1" w:styleId="CharTok" w:type="character">
     <w:name w:val="CharTok"/>
     <w:basedOn w:val="VerbatimChar"/>
     <w:rPr>
       <w:color w:val="4070a0"/>
     </w:rPr>
   </w:style>
-  <w:style w:type="character" w:customStyle="1" w:styleId="SpecialCharTok">
+  <w:style w:customStyle="1" w:styleId="SpecialCharTok" w:type="character">
     <w:name w:val="SpecialCharTok"/>
     <w:basedOn w:val="VerbatimChar"/>
     <w:rPr>
       <w:color w:val="4070a0"/>
     </w:rPr>
   </w:style>
-  <w:style w:type="character" w:customStyle="1" w:styleId="StringTok">
+  <w:style w:customStyle="1" w:styleId="StringTok" w:type="character">
     <w:name w:val="StringTok"/>
     <w:basedOn w:val="VerbatimChar"/>
     <w:rPr>
       <w:color w:val="4070a0"/>
     </w:rPr>
   </w:style>
-  <w:style w:type="character" w:customStyle="1" w:styleId="VerbatimStringTok">
+  <w:style w:customStyle="1" w:styleId="VerbatimStringTok" w:type="character">
     <w:name w:val="VerbatimStringTok"/>
     <w:basedOn w:val="VerbatimChar"/>
     <w:rPr>
       <w:color w:val="4070a0"/>
     </w:rPr>
   </w:style>
-  <w:style w:type="character" w:customStyle="1" w:styleId="SpecialStringTok">
+  <w:style w:customStyle="1" w:styleId="SpecialStringTok" w:type="character">
     <w:name w:val="SpecialStringTok"/>
     <w:basedOn w:val="VerbatimChar"/>
     <w:rPr>
       <w:color w:val="bb6688"/>
     </w:rPr>
   </w:style>
-  <w:style w:type="character" w:customStyle="1" w:styleId="ImportTok">
+  <w:style w:customStyle="1" w:styleId="ImportTok" w:type="character">
     <w:name w:val="ImportTok"/>
     <w:basedOn w:val="VerbatimChar"/>
     <w:rPr>
@@ -5360,7 +5818,7 @@
       <w:color w:val="008000"/>
     </w:rPr>
   </w:style>
-  <w:style w:type="character" w:customStyle="1" w:styleId="CommentTok">
+  <w:style w:customStyle="1" w:styleId="CommentTok" w:type="character">
     <w:name w:val="CommentTok"/>
     <w:basedOn w:val="VerbatimChar"/>
     <w:rPr>
@@ -5368,7 +5826,7 @@
       <w:color w:val="60a0b0"/>
     </w:rPr>
   </w:style>
-  <w:style w:type="character" w:customStyle="1" w:styleId="DocumentationTok">
+  <w:style w:customStyle="1" w:styleId="DocumentationTok" w:type="character">
     <w:name w:val="DocumentationTok"/>
     <w:basedOn w:val="VerbatimChar"/>
     <w:rPr>
@@ -5376,7 +5834,7 @@
       <w:color w:val="ba2121"/>
     </w:rPr>
   </w:style>
-  <w:style w:type="character" w:customStyle="1" w:styleId="AnnotationTok">
+  <w:style w:customStyle="1" w:styleId="AnnotationTok" w:type="character">
     <w:name w:val="AnnotationTok"/>
     <w:basedOn w:val="VerbatimChar"/>
     <w:rPr>
@@ -5385,7 +5843,7 @@
       <w:color w:val="60a0b0"/>
     </w:rPr>
   </w:style>
-  <w:style w:type="character" w:customStyle="1" w:styleId="CommentVarTok">
+  <w:style w:customStyle="1" w:styleId="CommentVarTok" w:type="character">
     <w:name w:val="CommentVarTok"/>
     <w:basedOn w:val="VerbatimChar"/>
     <w:rPr>
@@ -5394,28 +5852,28 @@
       <w:color w:val="60a0b0"/>
     </w:rPr>
   </w:style>
-  <w:style w:type="character" w:customStyle="1" w:styleId="OtherTok">
+  <w:style w:customStyle="1" w:styleId="OtherTok" w:type="character">
     <w:name w:val="OtherTok"/>
     <w:basedOn w:val="VerbatimChar"/>
     <w:rPr>
       <w:color w:val="007020"/>
     </w:rPr>
   </w:style>
-  <w:style w:type="character" w:customStyle="1" w:styleId="FunctionTok">
+  <w:style w:customStyle="1" w:styleId="FunctionTok" w:type="character">
     <w:name w:val="FunctionTok"/>
     <w:basedOn w:val="VerbatimChar"/>
     <w:rPr>
       <w:color w:val="06287e"/>
     </w:rPr>
   </w:style>
-  <w:style w:type="character" w:customStyle="1" w:styleId="VariableTok">
+  <w:style w:customStyle="1" w:styleId="VariableTok" w:type="character">
     <w:name w:val="VariableTok"/>
     <w:basedOn w:val="VerbatimChar"/>
     <w:rPr>
       <w:color w:val="19177c"/>
     </w:rPr>
   </w:style>
-  <w:style w:type="character" w:customStyle="1" w:styleId="ControlFlowTok">
+  <w:style w:customStyle="1" w:styleId="ControlFlowTok" w:type="character">
     <w:name w:val="ControlFlowTok"/>
     <w:basedOn w:val="VerbatimChar"/>
     <w:rPr>
@@ -5423,45 +5881,45 @@
       <w:color w:val="007020"/>
     </w:rPr>
   </w:style>
-  <w:style w:type="character" w:customStyle="1" w:styleId="OperatorTok">
+  <w:style w:customStyle="1" w:styleId="OperatorTok" w:type="character">
     <w:name w:val="OperatorTok"/>
     <w:basedOn w:val="VerbatimChar"/>
     <w:rPr>
       <w:color w:val="666666"/>
     </w:rPr>
   </w:style>
-  <w:style w:type="character" w:customStyle="1" w:styleId="BuiltInTok">
+  <w:style w:customStyle="1" w:styleId="BuiltInTok" w:type="character">
     <w:name w:val="BuiltInTok"/>
     <w:basedOn w:val="VerbatimChar"/>
     <w:rPr>
       <w:color w:val="008000"/>
     </w:rPr>
   </w:style>
-  <w:style w:type="character" w:customStyle="1" w:styleId="ExtensionTok">
+  <w:style w:customStyle="1" w:styleId="ExtensionTok" w:type="character">
     <w:name w:val="ExtensionTok"/>
     <w:basedOn w:val="VerbatimChar"/>
     <w:rPr/>
   </w:style>
-  <w:style w:type="character" w:customStyle="1" w:styleId="PreprocessorTok">
+  <w:style w:customStyle="1" w:styleId="PreprocessorTok" w:type="character">
     <w:name w:val="PreprocessorTok"/>
     <w:basedOn w:val="VerbatimChar"/>
     <w:rPr>
       <w:color w:val="bc7a00"/>
     </w:rPr>
   </w:style>
-  <w:style w:type="character" w:customStyle="1" w:styleId="AttributeTok">
+  <w:style w:customStyle="1" w:styleId="AttributeTok" w:type="character">
     <w:name w:val="AttributeTok"/>
     <w:basedOn w:val="VerbatimChar"/>
     <w:rPr>
       <w:color w:val="7d9029"/>
     </w:rPr>
   </w:style>
-  <w:style w:type="character" w:customStyle="1" w:styleId="RegionMarkerTok">
+  <w:style w:customStyle="1" w:styleId="RegionMarkerTok" w:type="character">
     <w:name w:val="RegionMarkerTok"/>
     <w:basedOn w:val="VerbatimChar"/>
     <w:rPr/>
   </w:style>
-  <w:style w:type="character" w:customStyle="1" w:styleId="InformationTok">
+  <w:style w:customStyle="1" w:styleId="InformationTok" w:type="character">
     <w:name w:val="InformationTok"/>
     <w:basedOn w:val="VerbatimChar"/>
     <w:rPr>
@@ -5470,7 +5928,7 @@
       <w:color w:val="60a0b0"/>
     </w:rPr>
   </w:style>
-  <w:style w:type="character" w:customStyle="1" w:styleId="WarningTok">
+  <w:style w:customStyle="1" w:styleId="WarningTok" w:type="character">
     <w:name w:val="WarningTok"/>
     <w:basedOn w:val="VerbatimChar"/>
     <w:rPr>
@@ -5479,7 +5937,7 @@
       <w:color w:val="60a0b0"/>
     </w:rPr>
   </w:style>
-  <w:style w:type="character" w:customStyle="1" w:styleId="AlertTok">
+  <w:style w:customStyle="1" w:styleId="AlertTok" w:type="character">
     <w:name w:val="AlertTok"/>
     <w:basedOn w:val="VerbatimChar"/>
     <w:rPr>
@@ -5487,7 +5945,7 @@
       <w:color w:val="ff0000"/>
     </w:rPr>
   </w:style>
-  <w:style w:type="character" w:customStyle="1" w:styleId="ErrorTok">
+  <w:style w:customStyle="1" w:styleId="ErrorTok" w:type="character">
     <w:name w:val="ErrorTok"/>
     <w:basedOn w:val="VerbatimChar"/>
     <w:rPr>
@@ -5495,7 +5953,7 @@
       <w:color w:val="ff0000"/>
     </w:rPr>
   </w:style>
-  <w:style w:type="character" w:customStyle="1" w:styleId="NormalTok">
+  <w:style w:customStyle="1" w:styleId="NormalTok" w:type="character">
     <w:name w:val="NormalTok"/>
     <w:basedOn w:val="VerbatimChar"/>
     <w:rPr/>

</xml_diff>

<commit_message>
docs(mvp): reconciliar F-001 — docs operativos hablan del rol 'el Coder', sin modelo
Plan_MVP (.md + .docx sincronizado) y Dia-01: se sustituyen GLM-5.2/DeepInfra/DeepSeek
por 'el Coder'. El nombre del modelo vive solo en F-001 (findings-register) y en la config
del arnes (spikes/SP-1, harness-metrics). Se quitan las cabeceras 'donde diga GLM, lease
DeepSeek', ya innecesarias. Se conserva la variable de credencial DEEPSEEK_API_KEY (config).
No se tocan el Status de julio ni docs/promp_arquitectura_stacktech.md (documentos de su fecha).

Co-Authored-By: Claude Opus 4.8 <noreply@anthropic.com>
</commit_message>
<xml_diff>
--- a/openspec/mvp/Plan_MVP_Bearingworld_v1.0.docx
+++ b/openspec/mvp/Plan_MVP_Bearingworld_v1.0.docx
@@ -74,213 +74,7 @@
         <w:t xml:space="preserve"> </w:t>
       </w:r>
       <w:r>
-        <w:t xml:space="preserve">demo funcional para socio potencial + piloto real del arnés de implementación (LangGraph · Opus 4.8 / DeepSeek-V4-Flash)</w:t>
-      </w:r>
-    </w:p>
-    <w:p>
-      <w:pPr>
-        <w:pStyle w:val="BlockText"/>
-      </w:pPr>
-      <w:r>
-        <w:rPr>
-          <w:b/>
-          <w:bCs/>
-        </w:rPr>
-        <w:t xml:space="preserve">Actualización · 5-ago-2026 (SP-1).</w:t>
-      </w:r>
-      <w:r>
-        <w:t xml:space="preserve"> </w:t>
-      </w:r>
-      <w:r>
-        <w:t xml:space="preserve">El nodo</w:t>
-      </w:r>
-      <w:r>
-        <w:t xml:space="preserve"> </w:t>
-      </w:r>
-      <w:r>
-        <w:rPr>
-          <w:b/>
-          <w:bCs/>
-        </w:rPr>
-        <w:t xml:space="preserve">Coder</w:t>
-      </w:r>
-      <w:r>
-        <w:t xml:space="preserve"> </w:t>
-      </w:r>
-      <w:r>
-        <w:t xml:space="preserve">del arnés es</w:t>
-      </w:r>
-      <w:r>
-        <w:t xml:space="preserve"> </w:t>
-      </w:r>
-      <w:r>
-        <w:rPr>
-          <w:b/>
-          <w:bCs/>
-        </w:rPr>
-        <w:t xml:space="preserve">DeepSeek-V4-Flash</w:t>
-      </w:r>
-      <w:r>
-        <w:t xml:space="preserve"> </w:t>
-      </w:r>
-      <w:r>
-        <w:t xml:space="preserve">(</w:t>
-      </w:r>
-      <w:r>
-        <w:rPr>
-          <w:rStyle w:val="VerbatimChar"/>
-        </w:rPr>
-        <w:t xml:space="preserve">deepseek-v4-flash</w:t>
-      </w:r>
-      <w:r>
-        <w:t xml:space="preserve">, DeepSeek oficial, vía</w:t>
-      </w:r>
-      <w:r>
-        <w:t xml:space="preserve"> </w:t>
-      </w:r>
-      <w:r>
-        <w:rPr>
-          <w:rStyle w:val="VerbatimChar"/>
-        </w:rPr>
-        <w:t xml:space="preserve">DEEPSEEK_API_KEY</w:t>
-      </w:r>
-      <w:r>
-        <w:t xml:space="preserve">), no GLM-5.2/DeepInfra como se</w:t>
-      </w:r>
-      <w:r>
-        <w:t xml:space="preserve"> </w:t>
-      </w:r>
-      <w:r>
-        <w:t xml:space="preserve">escribió el 4-ago. Cambio por coste (≈ $0.0036/pantalla en SP-1).</w:t>
-      </w:r>
-      <w:r>
-        <w:t xml:space="preserve"> </w:t>
-      </w:r>
-      <w:r>
-        <w:rPr>
-          <w:b/>
-          <w:bCs/>
-        </w:rPr>
-        <w:t xml:space="preserve">En todo el documento,</w:t>
-      </w:r>
-      <w:r>
-        <w:rPr>
-          <w:b/>
-          <w:bCs/>
-        </w:rPr>
-        <w:t xml:space="preserve"> </w:t>
-      </w:r>
-      <w:r>
-        <w:rPr>
-          <w:b/>
-          <w:bCs/>
-        </w:rPr>
-        <w:t xml:space="preserve">donde diga</w:t>
-      </w:r>
-      <w:r>
-        <w:rPr>
-          <w:b/>
-          <w:bCs/>
-        </w:rPr>
-        <w:t xml:space="preserve"> </w:t>
-      </w:r>
-      <w:r>
-        <w:rPr>
-          <w:b/>
-          <w:bCs/>
-        </w:rPr>
-        <w:t xml:space="preserve">“GLM-5.2”</w:t>
-      </w:r>
-      <w:r>
-        <w:rPr>
-          <w:b/>
-          <w:bCs/>
-        </w:rPr>
-        <w:t xml:space="preserve"> </w:t>
-      </w:r>
-      <w:r>
-        <w:rPr>
-          <w:b/>
-          <w:bCs/>
-        </w:rPr>
-        <w:t xml:space="preserve">/</w:t>
-      </w:r>
-      <w:r>
-        <w:rPr>
-          <w:b/>
-          <w:bCs/>
-        </w:rPr>
-        <w:t xml:space="preserve"> </w:t>
-      </w:r>
-      <w:r>
-        <w:rPr>
-          <w:b/>
-          <w:bCs/>
-        </w:rPr>
-        <w:t xml:space="preserve">“GLM”</w:t>
-      </w:r>
-      <w:r>
-        <w:rPr>
-          <w:b/>
-          <w:bCs/>
-        </w:rPr>
-        <w:t xml:space="preserve"> </w:t>
-      </w:r>
-      <w:r>
-        <w:rPr>
-          <w:b/>
-          <w:bCs/>
-        </w:rPr>
-        <w:t xml:space="preserve">/</w:t>
-      </w:r>
-      <w:r>
-        <w:rPr>
-          <w:b/>
-          <w:bCs/>
-        </w:rPr>
-        <w:t xml:space="preserve"> </w:t>
-      </w:r>
-      <w:r>
-        <w:rPr>
-          <w:b/>
-          <w:bCs/>
-        </w:rPr>
-        <w:t xml:space="preserve">“DeepInfra”</w:t>
-      </w:r>
-      <w:r>
-        <w:rPr>
-          <w:b/>
-          <w:bCs/>
-        </w:rPr>
-        <w:t xml:space="preserve"> </w:t>
-      </w:r>
-      <w:r>
-        <w:rPr>
-          <w:b/>
-          <w:bCs/>
-        </w:rPr>
-        <w:t xml:space="preserve">como Coder, léase DeepSeek-V4-Flash.</w:t>
-      </w:r>
-      <w:r>
-        <w:t xml:space="preserve"> </w:t>
-      </w:r>
-      <w:r>
-        <w:t xml:space="preserve">Ver</w:t>
-      </w:r>
-      <w:r>
-        <w:t xml:space="preserve"> </w:t>
-      </w:r>
-      <w:r>
-        <w:rPr>
-          <w:rStyle w:val="VerbatimChar"/>
-        </w:rPr>
-        <w:t xml:space="preserve">findings-register.md</w:t>
-      </w:r>
-      <w:r>
-        <w:t xml:space="preserve"> </w:t>
-      </w:r>
-      <w:r>
-        <w:t xml:space="preserve">F-001.</w:t>
+        <w:t xml:space="preserve">demo funcional para socio potencial + piloto real del arnés de implementación (LangGraph · Opus 4.8 orquestación + Coder ejecución)</w:t>
       </w:r>
     </w:p>
     <w:p>
@@ -611,13 +405,13 @@
       </w:r>
     </w:p>
     <w:bookmarkEnd w:id="9"/>
-    <w:bookmarkStart w:id="10" w:name="X05361d9f2c83928fcd32b2b9cf9b7dcfcb36fbf"/>
+    <w:bookmarkStart w:id="10" w:name="X4edefc1ea8f526b28d89a6cc27e41bd97092ae9"/>
     <w:p>
       <w:pPr>
         <w:pStyle w:val="Heading2"/>
       </w:pPr>
       <w:r>
-        <w:t xml:space="preserve">1. Principio de reparto: qué hace el Coder (DeepSeek) y qué no</w:t>
+        <w:t xml:space="preserve">1. Principio de reparto: qué hace el Coder y qué no</w:t>
       </w:r>
     </w:p>
     <w:p>
@@ -650,7 +444,7 @@
           <w:b/>
           <w:bCs/>
         </w:rPr>
-        <w:t xml:space="preserve">DeepSeek-V4-Flash (nodo Coder del arnés) — trabajo de alto volumen, mecánico, con verdad de referencia visible:</w:t>
+        <w:t xml:space="preserve">El Coder (nodo del arnés) — trabajo de alto volumen, mecánico, con verdad de referencia visible:</w:t>
       </w:r>
     </w:p>
     <w:p>
@@ -798,7 +592,7 @@
         <w:t xml:space="preserve">el criterio del stack v1.2 (</w:t>
       </w:r>
       <w:r>
-        <w:t xml:space="preserve">“Opus para orquestación y decisiones de alto valor, GLM para ejecución de código de alto volumen”</w:t>
+        <w:t xml:space="preserve">“Opus para orquestación y decisiones de alto valor, el Coder para ejecución de código de alto volumen”</w:t>
       </w:r>
       <w:r>
         <w:t xml:space="preserve">), no una excepción a él.</w:t>
@@ -901,18 +695,18 @@
                 <w:b/>
                 <w:bCs/>
               </w:rPr>
-              <w:t xml:space="preserve">SP-1 · GLM</w:t>
-            </w:r>
-          </w:p>
-        </w:tc>
-        <w:tc>
-          <w:tcPr/>
-          <w:p>
-            <w:pPr>
-              <w:pStyle w:val="Compact"/>
-            </w:pPr>
-            <w:r>
-              <w:t xml:space="preserve">¿GLM-5.2 convierte un HTML aprobado a React con calidad utilizable?</w:t>
+              <w:t xml:space="preserve">SP-1 · Coder</w:t>
+            </w:r>
+          </w:p>
+        </w:tc>
+        <w:tc>
+          <w:tcPr/>
+          <w:p>
+            <w:pPr>
+              <w:pStyle w:val="Compact"/>
+            </w:pPr>
+            <w:r>
+              <w:t xml:space="preserve">¿El Coder convierte un HTML aprobado a React con calidad utilizable?</w:t>
             </w:r>
           </w:p>
         </w:tc>
@@ -1037,7 +831,7 @@
         <w:t xml:space="preserve"> </w:t>
       </w:r>
       <w:r>
-        <w:t xml:space="preserve">GLM sale del camino crítico y pasa a pista paralela de experimentación. El MVP lo construye Claude Code. Los objetivos 2 y 4 se cumplen igual — con datos de fallo, que también son datos.</w:t>
+        <w:t xml:space="preserve">el Coder sale del camino crítico y pasa a pista paralela de experimentación. El MVP lo construye Claude Code. Los objetivos 2 y 4 se cumplen igual — con datos de fallo, que también son datos.</w:t>
       </w:r>
     </w:p>
     <w:p>
@@ -1406,7 +1200,7 @@
               <w:pStyle w:val="Compact"/>
             </w:pPr>
             <w:r>
-              <w:t xml:space="preserve">GLM</w:t>
+              <w:t xml:space="preserve">Coder</w:t>
             </w:r>
           </w:p>
         </w:tc>
@@ -1485,7 +1279,7 @@
               <w:t xml:space="preserve"> </w:t>
             </w:r>
             <w:r>
-              <w:t xml:space="preserve">grafo LangGraph de 2 nodos — Coder (GLM) + Test-runner</w:t>
+              <w:t xml:space="preserve">grafo LangGraph de 2 nodos — Coder + Test-runner</w:t>
             </w:r>
           </w:p>
         </w:tc>
@@ -1565,7 +1359,7 @@
         <w:t xml:space="preserve"> </w:t>
       </w:r>
       <w:r>
-        <w:t xml:space="preserve">La primera salida de GLM debe ser una pantalla representativa pero no crítica: MSG-01 es una lista, con estructura clara y fallo barato. SRCH-01 es la pantalla núcleo y la más delicada — entra en S2, con revisión a mano.</w:t>
+        <w:t xml:space="preserve">La primera salida del Coder debe ser una pantalla representativa pero no crítica: MSG-01 es una lista, con estructura clara y fallo barato. SRCH-01 es la pantalla núcleo y la más delicada — entra en S2, con revisión a mano.</w:t>
       </w:r>
     </w:p>
     <w:p>
@@ -1732,20 +1526,7 @@
         <w:t xml:space="preserve">LangSmith</w:t>
       </w:r>
       <w:r>
-        <w:t xml:space="preserve">, DeepSeek-V4-Flash vía</w:t>
-      </w:r>
-      <w:r>
-        <w:t xml:space="preserve"> </w:t>
-      </w:r>
-      <w:r>
-        <w:rPr>
-          <w:b/>
-          <w:bCs/>
-        </w:rPr>
-        <w:t xml:space="preserve">DeepSeek oficial</w:t>
-      </w:r>
-      <w:r>
-        <w:t xml:space="preserve">, Opus/Sonnet vía</w:t>
+        <w:t xml:space="preserve">, el Coder vía su proveedor, Opus/Sonnet vía</w:t>
       </w:r>
       <w:r>
         <w:t xml:space="preserve"> </w:t>
@@ -2772,7 +2553,7 @@
         <w:rPr>
           <w:rStyle w:val="VerbatimChar"/>
         </w:rPr>
-        <w:t xml:space="preserve">        ↓  GLM-5.2 (Coder)</w:t>
+        <w:t xml:space="preserve">        ↓  Coder</w:t>
       </w:r>
       <w:r>
         <w:br/>
@@ -2856,7 +2637,7 @@
           <w:b/>
           <w:bCs/>
         </w:rPr>
-        <w:t xml:space="preserve">GLM nunca escribe los tests que lo evalúan.</w:t>
+        <w:t xml:space="preserve">El Coder nunca escribe los tests que lo evalúan.</w:t>
       </w:r>
       <w:r>
         <w:t xml:space="preserve"> </w:t>
@@ -2908,7 +2689,7 @@
         <w:t xml:space="preserve"> </w:t>
       </w:r>
       <w:r>
-        <w:t xml:space="preserve">Coder (GLM) + Test-runner. Es donde hay verdad ejecutable.</w:t>
+        <w:t xml:space="preserve">Coder + Test-runner. Es donde hay verdad ejecutable.</w:t>
       </w:r>
     </w:p>
     <w:p>
@@ -3857,7 +3638,7 @@
               <w:pStyle w:val="Compact"/>
             </w:pPr>
             <w:r>
-              <w:t xml:space="preserve">Límite observado de GLM o Sonnet → afecta a la asignación de modelos del v1.2</w:t>
+              <w:t xml:space="preserve">Límite observado del Coder o de Sonnet → afecta a la asignación de modelos del v1.2</w:t>
             </w:r>
           </w:p>
         </w:tc>
@@ -4171,7 +3952,7 @@
               <w:pStyle w:val="Compact"/>
             </w:pPr>
             <w:r>
-              <w:t xml:space="preserve">GLM no da calidad utilizable</w:t>
+              <w:t xml:space="preserve">El Coder no da calidad utilizable</w:t>
             </w:r>
           </w:p>
         </w:tc>
@@ -4193,7 +3974,7 @@
               <w:pStyle w:val="Compact"/>
             </w:pPr>
             <w:r>
-              <w:t xml:space="preserve">SP-1 el día 1. Plan B: GLM a pista paralela, Claude Code construye.</w:t>
+              <w:t xml:space="preserve">SP-1 el día 1. Plan B: el Coder a pista paralela, Claude Code construye.</w:t>
             </w:r>
           </w:p>
         </w:tc>

</xml_diff>